<commit_message>
Refine Week 8 output sections and add GitHub and lecture links
</commit_message>
<xml_diff>
--- a/WEEK 8/Week8_Programs_16_17.docx
+++ b/WEEK 8/Week8_Programs_16_17.docx
@@ -6570,7 +6570,8 @@
             <w:tcW w:w="1696" w:type="dxa"/>
             <w:tcBorders/>
             <w:shd w:color="auto" w:fill="F7CAAC" w:themeFill="accent2" w:themeFillTint="66" w:val="clear"/>
-            <w:vAlign w:val="center"/>
+            <w:vAlign w:val="top"/>
+            <w:vMerge w:val="restart"/>
           </w:tcPr>
           <w:p>
             <w:pPr>
@@ -6647,96 +6648,6 @@
                 <w:lang w:val="en-IN" w:eastAsia="en-US" w:bidi="ar-SA"/>
               </w:rPr>
               <w:t>Observations</w:t>
-            </w:r>
-          </w:p>
-        </w:tc>
-        <w:tc>
-          <w:tcPr>
-            <w:tcW w:w="7319" w:type="dxa"/>
-            <w:gridSpan w:val="4"/>
-            <w:tcBorders/>
-            <w:shd w:color="auto" w:fill="E2EFD9" w:themeFill="accent6" w:themeFillTint="33" w:val="clear"/>
-            <w:vAlign w:val="top"/>
-          </w:tcPr>
-          <w:p>
-            <w:pPr>
-              <w:keepNext w:val="0"/>
-              <w:pageBreakBefore/>
-              <w:widowControl/>
-              <w:spacing w:before="0" w:after="60" w:line="240" w:lineRule="auto"/>
-              <w:jc w:val="left"/>
-            </w:pPr>
-            <w:r>
-              <w:rPr>
-                <w:rFonts w:ascii="Times New Roman" w:hAnsi="Times New Roman"/>
-                <w:b w:val="0"/>
-                <w:color w:val="000000"/>
-                <w:sz w:val="20"/>
-              </w:rPr>
-              <w:t>Outputs below were regenerated by executing the supplied notebook code. The document contains static snapshots; interactive hover, zoom and (for 3D) rotation are available in the HTML produced by the notebook. Notebook display calls were suppressed only during headless verification.</w:t>
-            </w:r>
-          </w:p>
-        </w:tc>
-        <w:tc>
-          <w:tcPr>
-            <w:tcW w:w="56" w:type="dxa"/>
-            <w:tcBorders>
-              <w:top w:val="nil"/>
-              <w:left w:val="nil"/>
-              <w:bottom w:val="nil"/>
-              <w:right w:val="nil"/>
-            </w:tcBorders>
-          </w:tcPr>
-          <w:p>
-            <w:pPr>
-              <w:pStyle w:val="Normal"/>
-              <w:widowControl/>
-              <w:spacing w:lineRule="auto" w:line="240" w:before="0" w:after="0"/>
-              <w:jc w:val="left"/>
-              <w:rPr>
-                <w:rFonts w:eastAsia="Calibri" w:cs=""/>
-                <w:kern w:val="0"/>
-                <w:szCs w:val="22"/>
-                <w:lang w:val="en-IN" w:eastAsia="en-US" w:bidi="ar-SA"/>
-              </w:rPr>
-            </w:pPr>
-            <w:r>
-              <w:rPr>
-                <w:rFonts w:eastAsia="Calibri" w:cs=""/>
-                <w:kern w:val="0"/>
-                <w:szCs w:val="22"/>
-                <w:lang w:val="en-IN" w:eastAsia="en-US" w:bidi="ar-SA"/>
-              </w:rPr>
-            </w:r>
-          </w:p>
-        </w:tc>
-      </w:tr>
-      <w:tr>
-        <w:trPr>
-          <w:trHeight w:val="3803" w:hRule="atLeast"/>
-          <w:cantSplit/>
-        </w:trPr>
-        <w:tc>
-          <w:tcPr>
-            <w:tcW w:w="1696" w:type="dxa"/>
-            <w:tcBorders/>
-            <w:shd w:color="auto" w:fill="F7CAAC" w:themeFill="accent2" w:themeFillTint="66" w:val="clear"/>
-            <w:vAlign w:val="top"/>
-          </w:tcPr>
-          <w:p>
-            <w:pPr>
-              <w:keepNext w:val="0"/>
-              <w:widowControl/>
-              <w:spacing w:before="0" w:after="60" w:line="240" w:lineRule="auto"/>
-              <w:jc w:val="left"/>
-            </w:pPr>
-            <w:r>
-              <w:rPr>
-                <w:rFonts w:ascii="Times New Roman" w:hAnsi="Times New Roman"/>
-                <w:b w:val="0"/>
-                <w:color w:val="000000"/>
-                <w:sz w:val="22"/>
-              </w:rPr>
             </w:r>
           </w:p>
         </w:tc>
@@ -6879,6 +6790,7 @@
             <w:tcBorders/>
             <w:shd w:color="auto" w:fill="F7CAAC" w:themeFill="accent2" w:themeFillTint="66" w:val="clear"/>
             <w:vAlign w:val="top"/>
+            <w:vMerge w:val="continue"/>
           </w:tcPr>
           <w:p>
             <w:pPr>
@@ -7036,6 +6948,7 @@
             <w:tcBorders/>
             <w:shd w:color="auto" w:fill="F7CAAC" w:themeFill="accent2" w:themeFillTint="66" w:val="clear"/>
             <w:vAlign w:val="top"/>
+            <w:vMerge w:val="continue"/>
           </w:tcPr>
           <w:p>
             <w:pPr>
@@ -7193,6 +7106,7 @@
             <w:tcBorders/>
             <w:shd w:color="auto" w:fill="F7CAAC" w:themeFill="accent2" w:themeFillTint="66" w:val="clear"/>
             <w:vAlign w:val="top"/>
+            <w:vMerge w:val="continue"/>
           </w:tcPr>
           <w:p>
             <w:pPr>
@@ -7350,6 +7264,7 @@
             <w:tcBorders/>
             <w:shd w:color="auto" w:fill="F7CAAC" w:themeFill="accent2" w:themeFillTint="66" w:val="clear"/>
             <w:vAlign w:val="top"/>
+            <w:vMerge w:val="continue"/>
           </w:tcPr>
           <w:p>
             <w:pPr>
@@ -7507,6 +7422,7 @@
             <w:tcBorders/>
             <w:shd w:color="auto" w:fill="F7CAAC" w:themeFill="accent2" w:themeFillTint="66" w:val="clear"/>
             <w:vAlign w:val="top"/>
+            <w:vMerge w:val="continue"/>
           </w:tcPr>
           <w:p>
             <w:pPr>
@@ -7877,6 +7793,16 @@
               </w:rPr>
               <w:t xml:space="preserve">5. Python notebook (GitHub link): </w:t>
             </w:r>
+            <w:hyperlink r:id="rId20">
+              <w:r>
+                <w:rPr>
+                  <w:color w:val="0563C1"/>
+                  <w:u w:val="single"/>
+                  <w:sz w:val="22"/>
+                </w:rPr>
+                <w:t>Open Program 16 on GitHub</w:t>
+              </w:r>
+            </w:hyperlink>
           </w:p>
           <w:p>
             <w:pPr>
@@ -7894,6 +7820,16 @@
               </w:rPr>
               <w:t xml:space="preserve">6. Class lecture link: </w:t>
             </w:r>
+            <w:hyperlink r:id="rId28">
+              <w:r>
+                <w:rPr>
+                  <w:color w:val="0563C1"/>
+                  <w:u w:val="single"/>
+                  <w:sz w:val="22"/>
+                </w:rPr>
+                <w:t>Open Week 8 lecture</w:t>
+              </w:r>
+            </w:hyperlink>
           </w:p>
           <w:p>
             <w:pPr>
@@ -14907,7 +14843,8 @@
             <w:tcW w:w="1696" w:type="dxa"/>
             <w:tcBorders/>
             <w:shd w:color="auto" w:fill="F7CAAC" w:themeFill="accent2" w:themeFillTint="66" w:val="clear"/>
-            <w:vAlign w:val="center"/>
+            <w:vAlign w:val="top"/>
+            <w:vMerge w:val="restart"/>
           </w:tcPr>
           <w:p>
             <w:pPr>
@@ -14984,96 +14921,6 @@
                 <w:lang w:val="en-IN" w:eastAsia="en-US" w:bidi="ar-SA"/>
               </w:rPr>
               <w:t>Observations</w:t>
-            </w:r>
-          </w:p>
-        </w:tc>
-        <w:tc>
-          <w:tcPr>
-            <w:tcW w:w="7319" w:type="dxa"/>
-            <w:gridSpan w:val="4"/>
-            <w:tcBorders/>
-            <w:shd w:color="auto" w:fill="E2EFD9" w:themeFill="accent6" w:themeFillTint="33" w:val="clear"/>
-            <w:vAlign w:val="top"/>
-          </w:tcPr>
-          <w:p>
-            <w:pPr>
-              <w:keepNext w:val="0"/>
-              <w:pageBreakBefore/>
-              <w:widowControl/>
-              <w:spacing w:before="0" w:after="60" w:line="240" w:lineRule="auto"/>
-              <w:jc w:val="left"/>
-            </w:pPr>
-            <w:r>
-              <w:rPr>
-                <w:rFonts w:ascii="Times New Roman" w:hAnsi="Times New Roman"/>
-                <w:b w:val="0"/>
-                <w:color w:val="000000"/>
-                <w:sz w:val="20"/>
-              </w:rPr>
-              <w:t>Outputs below were regenerated by executing the supplied notebook code. The document contains static snapshots; interactive hover, zoom and (for 3D) rotation are available in the HTML produced by the notebook. Notebook display calls were suppressed only during headless verification.</w:t>
-            </w:r>
-          </w:p>
-        </w:tc>
-        <w:tc>
-          <w:tcPr>
-            <w:tcW w:w="56" w:type="dxa"/>
-            <w:tcBorders>
-              <w:top w:val="nil"/>
-              <w:left w:val="nil"/>
-              <w:bottom w:val="nil"/>
-              <w:right w:val="nil"/>
-            </w:tcBorders>
-          </w:tcPr>
-          <w:p>
-            <w:pPr>
-              <w:pStyle w:val="Normal"/>
-              <w:widowControl/>
-              <w:spacing w:lineRule="auto" w:line="240" w:before="0" w:after="0"/>
-              <w:jc w:val="left"/>
-              <w:rPr>
-                <w:rFonts w:eastAsia="Calibri" w:cs=""/>
-                <w:kern w:val="0"/>
-                <w:szCs w:val="22"/>
-                <w:lang w:val="en-IN" w:eastAsia="en-US" w:bidi="ar-SA"/>
-              </w:rPr>
-            </w:pPr>
-            <w:r>
-              <w:rPr>
-                <w:rFonts w:eastAsia="Calibri" w:cs=""/>
-                <w:kern w:val="0"/>
-                <w:szCs w:val="22"/>
-                <w:lang w:val="en-IN" w:eastAsia="en-US" w:bidi="ar-SA"/>
-              </w:rPr>
-            </w:r>
-          </w:p>
-        </w:tc>
-      </w:tr>
-      <w:tr>
-        <w:trPr>
-          <w:trHeight w:val="2992" w:hRule="atLeast"/>
-          <w:cantSplit/>
-        </w:trPr>
-        <w:tc>
-          <w:tcPr>
-            <w:tcW w:w="1696" w:type="dxa"/>
-            <w:tcBorders/>
-            <w:shd w:color="auto" w:fill="F7CAAC" w:themeFill="accent2" w:themeFillTint="66" w:val="clear"/>
-            <w:vAlign w:val="top"/>
-          </w:tcPr>
-          <w:p>
-            <w:pPr>
-              <w:keepNext w:val="0"/>
-              <w:widowControl/>
-              <w:spacing w:before="0" w:after="60" w:line="240" w:lineRule="auto"/>
-              <w:jc w:val="left"/>
-            </w:pPr>
-            <w:r>
-              <w:rPr>
-                <w:rFonts w:ascii="Times New Roman" w:hAnsi="Times New Roman"/>
-                <w:b w:val="0"/>
-                <w:color w:val="000000"/>
-                <w:sz w:val="22"/>
-              </w:rPr>
             </w:r>
           </w:p>
         </w:tc>
@@ -15116,7 +14963,7 @@
                           <pic:cNvPicPr/>
                         </pic:nvPicPr>
                         <pic:blipFill>
-                          <a:blip r:embed="rId20"/>
+                          <a:blip r:embed="rId29"/>
                           <a:stretch>
                             <a:fillRect/>
                           </a:stretch>
@@ -15216,6 +15063,7 @@
             <w:tcBorders/>
             <w:shd w:color="auto" w:fill="F7CAAC" w:themeFill="accent2" w:themeFillTint="66" w:val="clear"/>
             <w:vAlign w:val="top"/>
+            <w:vMerge w:val="continue"/>
           </w:tcPr>
           <w:p>
             <w:pPr>
@@ -15273,7 +15121,7 @@
                           <pic:cNvPicPr/>
                         </pic:nvPicPr>
                         <pic:blipFill>
-                          <a:blip r:embed="rId28"/>
+                          <a:blip r:embed="rId30"/>
                           <a:stretch>
                             <a:fillRect/>
                           </a:stretch>
@@ -15373,6 +15221,7 @@
             <w:tcBorders/>
             <w:shd w:color="auto" w:fill="F7CAAC" w:themeFill="accent2" w:themeFillTint="66" w:val="clear"/>
             <w:vAlign w:val="top"/>
+            <w:vMerge w:val="continue"/>
           </w:tcPr>
           <w:p>
             <w:pPr>
@@ -15430,7 +15279,7 @@
                           <pic:cNvPicPr/>
                         </pic:nvPicPr>
                         <pic:blipFill>
-                          <a:blip r:embed="rId29"/>
+                          <a:blip r:embed="rId39"/>
                           <a:stretch>
                             <a:fillRect/>
                           </a:stretch>
@@ -15530,6 +15379,7 @@
             <w:tcBorders/>
             <w:shd w:color="auto" w:fill="F7CAAC" w:themeFill="accent2" w:themeFillTint="66" w:val="clear"/>
             <w:vAlign w:val="top"/>
+            <w:vMerge w:val="continue"/>
           </w:tcPr>
           <w:p>
             <w:pPr>
@@ -15587,7 +15437,7 @@
                           <pic:cNvPicPr/>
                         </pic:nvPicPr>
                         <pic:blipFill>
-                          <a:blip r:embed="rId30"/>
+                          <a:blip r:embed="rId40"/>
                           <a:stretch>
                             <a:fillRect/>
                           </a:stretch>
@@ -15687,6 +15537,7 @@
             <w:tcBorders/>
             <w:shd w:color="auto" w:fill="F7CAAC" w:themeFill="accent2" w:themeFillTint="66" w:val="clear"/>
             <w:vAlign w:val="top"/>
+            <w:vMerge w:val="continue"/>
           </w:tcPr>
           <w:p>
             <w:pPr>
@@ -15744,7 +15595,7 @@
                           <pic:cNvPicPr/>
                         </pic:nvPicPr>
                         <pic:blipFill>
-                          <a:blip r:embed="rId39"/>
+                          <a:blip r:embed="rId41"/>
                           <a:stretch>
                             <a:fillRect/>
                           </a:stretch>
@@ -15844,6 +15695,7 @@
             <w:tcBorders/>
             <w:shd w:color="auto" w:fill="F7CAAC" w:themeFill="accent2" w:themeFillTint="66" w:val="clear"/>
             <w:vAlign w:val="top"/>
+            <w:vMerge w:val="continue"/>
           </w:tcPr>
           <w:p>
             <w:pPr>
@@ -15901,7 +15753,7 @@
                           <pic:cNvPicPr/>
                         </pic:nvPicPr>
                         <pic:blipFill>
-                          <a:blip r:embed="rId40"/>
+                          <a:blip r:embed="rId42"/>
                           <a:stretch>
                             <a:fillRect/>
                           </a:stretch>
@@ -16001,6 +15853,7 @@
             <w:tcBorders/>
             <w:shd w:color="auto" w:fill="F7CAAC" w:themeFill="accent2" w:themeFillTint="66" w:val="clear"/>
             <w:vAlign w:val="top"/>
+            <w:vMerge w:val="continue"/>
           </w:tcPr>
           <w:p>
             <w:pPr>
@@ -16058,7 +15911,7 @@
                           <pic:cNvPicPr/>
                         </pic:nvPicPr>
                         <pic:blipFill>
-                          <a:blip r:embed="rId41"/>
+                          <a:blip r:embed="rId43"/>
                           <a:stretch>
                             <a:fillRect/>
                           </a:stretch>
@@ -16371,6 +16224,16 @@
               </w:rPr>
               <w:t xml:space="preserve">5. Python notebook (GitHub link): </w:t>
             </w:r>
+            <w:hyperlink r:id="rId44">
+              <w:r>
+                <w:rPr>
+                  <w:color w:val="0563C1"/>
+                  <w:u w:val="single"/>
+                  <w:sz w:val="22"/>
+                </w:rPr>
+                <w:t>Open Program 17 on GitHub</w:t>
+              </w:r>
+            </w:hyperlink>
           </w:p>
           <w:p>
             <w:pPr>
@@ -16388,6 +16251,16 @@
               </w:rPr>
               <w:t xml:space="preserve">6. Class lecture link: </w:t>
             </w:r>
+            <w:hyperlink r:id="rId28">
+              <w:r>
+                <w:rPr>
+                  <w:color w:val="0563C1"/>
+                  <w:u w:val="single"/>
+                  <w:sz w:val="22"/>
+                </w:rPr>
+                <w:t>Open Week 8 lecture</w:t>
+              </w:r>
+            </w:hyperlink>
           </w:p>
           <w:p>
             <w:pPr>

</xml_diff>

<commit_message>
Remove specimen and template reference entries from Week 8 records
</commit_message>
<xml_diff>
--- a/WEEK 8/Week8_Programs_16_17.docx
+++ b/WEEK 8/Week8_Programs_16_17.docx
@@ -7830,40 +7830,6 @@
                 <w:t>Open Week 8 lecture</w:t>
               </w:r>
             </w:hyperlink>
-          </w:p>
-          <w:p>
-            <w:pPr>
-              <w:keepNext w:val="0"/>
-              <w:widowControl/>
-              <w:spacing w:before="0" w:after="160" w:line="240" w:lineRule="auto"/>
-              <w:jc w:val="left"/>
-            </w:pPr>
-            <w:r>
-              <w:rPr>
-                <w:rFonts w:ascii="Times New Roman" w:hAnsi="Times New Roman"/>
-                <w:b w:val="0"/>
-                <w:color w:val="000000"/>
-                <w:sz w:val="22"/>
-              </w:rPr>
-              <w:t xml:space="preserve">7. Specimen copy link: </w:t>
-            </w:r>
-          </w:p>
-          <w:p>
-            <w:pPr>
-              <w:keepNext w:val="0"/>
-              <w:widowControl/>
-              <w:spacing w:before="0" w:after="160" w:line="240" w:lineRule="auto"/>
-              <w:jc w:val="left"/>
-            </w:pPr>
-            <w:r>
-              <w:rPr>
-                <w:rFonts w:ascii="Times New Roman" w:hAnsi="Times New Roman"/>
-                <w:b w:val="0"/>
-                <w:color w:val="000000"/>
-                <w:sz w:val="22"/>
-              </w:rPr>
-              <w:t xml:space="preserve">8. Template link: </w:t>
-            </w:r>
           </w:p>
         </w:tc>
         <w:tc>
@@ -16261,40 +16227,6 @@
                 <w:t>Open Week 8 lecture</w:t>
               </w:r>
             </w:hyperlink>
-          </w:p>
-          <w:p>
-            <w:pPr>
-              <w:keepNext w:val="0"/>
-              <w:widowControl/>
-              <w:spacing w:before="0" w:after="160" w:line="240" w:lineRule="auto"/>
-              <w:jc w:val="left"/>
-            </w:pPr>
-            <w:r>
-              <w:rPr>
-                <w:rFonts w:ascii="Times New Roman" w:hAnsi="Times New Roman"/>
-                <w:b w:val="0"/>
-                <w:color w:val="000000"/>
-                <w:sz w:val="22"/>
-              </w:rPr>
-              <w:t xml:space="preserve">7. Specimen copy link: </w:t>
-            </w:r>
-          </w:p>
-          <w:p>
-            <w:pPr>
-              <w:keepNext w:val="0"/>
-              <w:widowControl/>
-              <w:spacing w:before="0" w:after="160" w:line="240" w:lineRule="auto"/>
-              <w:jc w:val="left"/>
-            </w:pPr>
-            <w:r>
-              <w:rPr>
-                <w:rFonts w:ascii="Times New Roman" w:hAnsi="Times New Roman"/>
-                <w:b w:val="0"/>
-                <w:color w:val="000000"/>
-                <w:sz w:val="22"/>
-              </w:rPr>
-              <w:t xml:space="preserve">8. Template link: </w:t>
-            </w:r>
           </w:p>
         </w:tc>
         <w:tc>

</xml_diff>